<commit_message>
Update of the Documents
</commit_message>
<xml_diff>
--- a/S2_Note_de_cadrage.docx
+++ b/S2_Note_de_cadrage.docx
@@ -107,9 +107,9 @@
         <w:tblLook w:val="0000" w:firstRow="0" w:lastRow="0" w:firstColumn="0" w:lastColumn="0" w:noHBand="0" w:noVBand="0"/>
       </w:tblPr>
       <w:tblGrid>
-        <w:gridCol w:w="1289"/>
-        <w:gridCol w:w="2586"/>
-        <w:gridCol w:w="1291"/>
+        <w:gridCol w:w="1272"/>
+        <w:gridCol w:w="2620"/>
+        <w:gridCol w:w="1274"/>
         <w:gridCol w:w="5040"/>
       </w:tblGrid>
       <w:tr>
@@ -228,7 +228,15 @@
                 <w:sz w:val="22"/>
                 <w:szCs w:val="22"/>
               </w:rPr>
-              <w:t>14/10/2026</w:t>
+              <w:t>21</w:t>
+            </w:r>
+            <w:r>
+              <w:rPr>
+                <w:rFonts w:ascii="Century" w:hAnsi="Century"/>
+                <w:sz w:val="22"/>
+                <w:szCs w:val="22"/>
+              </w:rPr>
+              <w:t>/10/2026</w:t>
             </w:r>
           </w:p>
         </w:tc>
@@ -291,7 +299,7 @@
                 <w:sz w:val="22"/>
                 <w:szCs w:val="22"/>
               </w:rPr>
-              <w:t>Eren ASLAN</w:t>
+              <w:t>Équipe Bug Smashers (harmonisée par Eren ASLAN &amp; Maxime ROPARS)</w:t>
             </w:r>
           </w:p>
         </w:tc>
@@ -428,7 +436,23 @@
                 <w:sz w:val="22"/>
                 <w:szCs w:val="22"/>
               </w:rPr>
-              <w:t>NovaCode Studio, une agence de développement de 12 personnes à Issy-les-Moulineaux, perd 2 à 3 jours à chaque intégration de développeurs juniors à cause d'installations non standardisées sur leurs ordinateurs personnels (Windows et Mac). L'objectif de ce projet est de concevoir un environnement de développement Python et de test Linux (famille Red Hat) standardisé, isolé, gratuit et reproductible. Cet environnement sera accompagné d'une notice pas-à-pas permettant à Julie, l'office manager non-informaticienne, de préparer et vérifier chaque poste en autonomie</w:t>
+              <w:t xml:space="preserve">NovaCode Studio, une agence de développement de 12 personnes à Issy-les-Moulineaux, perd 2 à 3 jours à chaque intégration de développeurs juniors à cause d'installations non standardisées sur leurs ordinateurs personnels (Windows et Mac). L'objectif de ce projet est de concevoir un environnement de développement Python et de test Linux (famille Red Hat) standardisé, isolé, gratuit et reproductible. Cet environnement sera accompagné d'une notice pas-à-pas permettant à </w:t>
+            </w:r>
+            <w:r>
+              <w:rPr>
+                <w:rFonts w:ascii="Century" w:hAnsi="Century"/>
+                <w:sz w:val="22"/>
+                <w:szCs w:val="22"/>
+              </w:rPr>
+              <w:t>Claire Vasseur</w:t>
+            </w:r>
+            <w:r>
+              <w:rPr>
+                <w:rFonts w:ascii="Century" w:hAnsi="Century"/>
+                <w:sz w:val="22"/>
+                <w:szCs w:val="22"/>
+              </w:rPr>
+              <w:t>, l'office manager non-informaticienne, de préparer et vérifier chaque poste en autonomie</w:t>
             </w:r>
           </w:p>
         </w:tc>
@@ -589,15 +613,15 @@
                 <w:sz w:val="22"/>
                 <w:szCs w:val="22"/>
               </w:rPr>
-              <w:t>Installation et configuration de l'éditeur de code (VS Code</w:t>
-            </w:r>
-            <w:r>
-              <w:rPr>
-                <w:rFonts w:ascii="Century" w:hAnsi="Century"/>
-                <w:sz w:val="22"/>
-                <w:szCs w:val="22"/>
-              </w:rPr>
-              <w:t xml:space="preserve"> ou PyCharm</w:t>
+              <w:t>Installation et configuration de l'éditeur de code (</w:t>
+            </w:r>
+            <w:r>
+              <w:rPr>
+                <w:rFonts w:ascii="Century" w:hAnsi="Century"/>
+                <w:sz w:val="22"/>
+                <w:szCs w:val="22"/>
+              </w:rPr>
+              <w:t>PyCharm Community Edition</w:t>
             </w:r>
             <w:r>
               <w:rPr>
@@ -1043,7 +1067,7 @@
                 <w:sz w:val="22"/>
                 <w:szCs w:val="22"/>
               </w:rPr>
-              <w:t>Poste configuré (VS Code, Python, Git, VM Linux Red Hat avec snapshot et fond d'écran), validé par script de test</w:t>
+              <w:t>Poste configuré (Python, Git, VM Linux Red Hat avec snapshot et fond d'écran), validé par script de test</w:t>
             </w:r>
           </w:p>
         </w:tc>
@@ -1136,7 +1160,23 @@
                 <w:sz w:val="22"/>
                 <w:szCs w:val="22"/>
               </w:rPr>
-              <w:t>Guide pas-à-pas illustré permettant à Julie (non-informaticienne) d'installer et vérifier le poste seule.</w:t>
+              <w:t xml:space="preserve">Guide pas-à-pas illustré permettant à </w:t>
+            </w:r>
+            <w:r>
+              <w:rPr>
+                <w:rFonts w:ascii="Century" w:hAnsi="Century"/>
+                <w:sz w:val="22"/>
+                <w:szCs w:val="22"/>
+              </w:rPr>
+              <w:t>Claire Vasseur</w:t>
+            </w:r>
+            <w:r>
+              <w:rPr>
+                <w:rFonts w:ascii="Century" w:hAnsi="Century"/>
+                <w:sz w:val="22"/>
+                <w:szCs w:val="22"/>
+              </w:rPr>
+              <w:t xml:space="preserve"> (non-informaticienne) d'installer et vérifier le poste seule.</w:t>
             </w:r>
           </w:p>
         </w:tc>
@@ -1639,7 +1679,23 @@
                 <w:sz w:val="22"/>
                 <w:szCs w:val="22"/>
               </w:rPr>
-              <w:t>Dimiytro DUDAR</w:t>
+              <w:t>D</w:t>
+            </w:r>
+            <w:r>
+              <w:rPr>
+                <w:rFonts w:ascii="Century" w:hAnsi="Century"/>
+                <w:sz w:val="22"/>
+                <w:szCs w:val="22"/>
+              </w:rPr>
+              <w:t>ymi</w:t>
+            </w:r>
+            <w:r>
+              <w:rPr>
+                <w:rFonts w:ascii="Century" w:hAnsi="Century"/>
+                <w:sz w:val="22"/>
+                <w:szCs w:val="22"/>
+              </w:rPr>
+              <w:t>tro DUDAR</w:t>
             </w:r>
           </w:p>
         </w:tc>
@@ -2089,7 +2145,7 @@
                 <w:sz w:val="22"/>
                 <w:szCs w:val="22"/>
               </w:rPr>
-              <w:t>PyCharm</w:t>
+              <w:t>PyCharm Community Edition</w:t>
             </w:r>
           </w:p>
         </w:tc>
@@ -3083,12 +3139,18 @@
               <w:t>Date :</w:t>
             </w:r>
             <w:r>
-              <w:rPr>
-                <w:rFonts w:ascii="Century" w:hAnsi="Century"/>
-                <w:sz w:val="22"/>
-                <w:szCs w:val="22"/>
-              </w:rPr>
-              <w:t>10/08/2026</w:t>
+              <w:t xml:space="preserve"> </w:t>
+            </w:r>
+            <w:r>
+              <w:t>14</w:t>
+            </w:r>
+            <w:r>
+              <w:rPr>
+                <w:rFonts w:ascii="Century" w:hAnsi="Century"/>
+                <w:sz w:val="22"/>
+                <w:szCs w:val="22"/>
+              </w:rPr>
+              <w:t>/10/2026</w:t>
             </w:r>
           </w:p>
         </w:tc>
@@ -3119,6 +3181,14 @@
               </w:rPr>
               <w:t>Date :</w:t>
             </w:r>
+            <w:r>
+              <w:rPr>
+                <w:rFonts w:ascii="Century" w:hAnsi="Century"/>
+                <w:sz w:val="22"/>
+                <w:szCs w:val="22"/>
+              </w:rPr>
+              <w:t>21/10/2026</w:t>
+            </w:r>
           </w:p>
         </w:tc>
         <w:tc>
@@ -3148,6 +3218,14 @@
               </w:rPr>
               <w:t>Date :</w:t>
             </w:r>
+            <w:r>
+              <w:rPr>
+                <w:rFonts w:ascii="Century" w:hAnsi="Century"/>
+                <w:sz w:val="22"/>
+                <w:szCs w:val="22"/>
+              </w:rPr>
+              <w:t>25/11/2026</w:t>
+            </w:r>
           </w:p>
         </w:tc>
         <w:tc>
@@ -3177,6 +3255,14 @@
               </w:rPr>
               <w:t>Date :</w:t>
             </w:r>
+            <w:r>
+              <w:rPr>
+                <w:rFonts w:ascii="Century" w:hAnsi="Century"/>
+                <w:sz w:val="22"/>
+                <w:szCs w:val="22"/>
+              </w:rPr>
+              <w:t>02/12/2026</w:t>
+            </w:r>
           </w:p>
         </w:tc>
         <w:tc>
@@ -3205,6 +3291,14 @@
                 <w:szCs w:val="22"/>
               </w:rPr>
               <w:t>Date :</w:t>
+            </w:r>
+            <w:r>
+              <w:rPr>
+                <w:rFonts w:ascii="Century" w:hAnsi="Century"/>
+                <w:sz w:val="22"/>
+                <w:szCs w:val="22"/>
+              </w:rPr>
+              <w:t>09/12/2026</w:t>
             </w:r>
           </w:p>
         </w:tc>
@@ -3583,7 +3677,23 @@
                 <w:sz w:val="22"/>
                 <w:szCs w:val="22"/>
               </w:rPr>
-              <w:t>Notice trop technique ou incompréhensible pour Julie (office manager)</w:t>
+              <w:t xml:space="preserve">Notice trop technique ou incompréhensible pour </w:t>
+            </w:r>
+            <w:r>
+              <w:rPr>
+                <w:rFonts w:ascii="Century" w:hAnsi="Century"/>
+                <w:sz w:val="22"/>
+                <w:szCs w:val="22"/>
+              </w:rPr>
+              <w:t>Claire Vasseur</w:t>
+            </w:r>
+            <w:r>
+              <w:rPr>
+                <w:rFonts w:ascii="Century" w:hAnsi="Century"/>
+                <w:sz w:val="22"/>
+                <w:szCs w:val="22"/>
+              </w:rPr>
+              <w:t xml:space="preserve"> (office manager)</w:t>
             </w:r>
           </w:p>
         </w:tc>

</xml_diff>